<commit_message>
Agregar citas y referencias en formato APA 7 a las secciones 3.4.3 y 4.2.2
Se citan las fuentes de MongoDB (serie Building with Patterns, manual y
antipatrones) y el libro de Coupal et al. (2023); tablas y figura con
rótulo y nota al estilo APA 7, y lista de referencias con sangría francesa.

Co-Authored-By: Claude Opus 5.5 <noreply@anthropic.com>
Claude-Session: https://claude.ai/code/session_01HYRJkRSYN6E1PmGnQP9Y6k
</commit_message>
<xml_diff>
--- a/Universidad/BASE DE DATOS/TRABAJO/Persona_3.4.3_y_4.2.2/Extras_3.4_y_Student_Outcome.docx
+++ b/Universidad/BASE DE DATOS/TRABAJO/Persona_3.4.3_y_4.2.2/Extras_3.4_y_Student_Outcome.docx
@@ -17,30 +17,35 @@
       <w:r>
         <w:rPr>
           <w:b w:val="0"/>
+          <w:i w:val="0"/>
         </w:rPr>
         <w:t xml:space="preserve">El enfoque no relacional complementa al diseño relacional presentado en la sección 3.3. Con el fin de evaluar las ventajas y desventajas de ambos modelos, el sistema SolarPulse IoT se implementa también en MongoDB, un sistema gestor de bases de datos orientado a documentos. En este enfoque la información no se organiza en tablas con columnas fijas, sino en </w:t>
       </w:r>
       <w:r>
         <w:rPr>
           <w:b/>
+          <w:i w:val="0"/>
         </w:rPr>
         <w:t>documentos BSON</w:t>
       </w:r>
       <w:r>
         <w:rPr>
           <w:b w:val="0"/>
+          <w:i w:val="0"/>
         </w:rPr>
         <w:t xml:space="preserve"> (un formato binario similar a JSON) agrupados en </w:t>
       </w:r>
       <w:r>
         <w:rPr>
           <w:b/>
+          <w:i w:val="0"/>
         </w:rPr>
         <w:t>colecciones</w:t>
       </w:r>
       <w:r>
         <w:rPr>
           <w:b w:val="0"/>
+          <w:i w:val="0"/>
         </w:rPr>
         <w:t>, cuyo esquema es flexible y puede incluir subdocumentos y arreglos.</w:t>
       </w:r>
@@ -52,8 +57,9 @@
       <w:r>
         <w:rPr>
           <w:b w:val="0"/>
+          <w:i w:val="0"/>
         </w:rPr>
-        <w:t>A diferencia del modelo relacional, que se diseña a partir de la normalización, el modelo documental se diseña según la forma en que la aplicación consulta los datos: lo que se lee junto se guarda junto. Este enfoque resulta especialmente conveniente para la telemetría de los sensores IoT, que exige escrituras masivas y continuas (RNF-3), un crecimiento acelerado del histórico (RNF-4) y respuestas rápidas en los tableros de control (RNF-5). En las siguientes secciones se presentan las colecciones definidas (3.4.1), las reglas de validación de esquema (3.4.2) y los patrones de modelo de datos aplicados (3.4.3).</w:t>
+        <w:t>A diferencia del modelo relacional, que se diseña a partir de la normalización, el modelo documental se diseña según la forma en que la aplicación consulta los datos: lo que se lee junto se guarda junto (Coupal et al., 2023). Este enfoque resulta especialmente conveniente para la telemetría de los sensores IoT, que exige escrituras masivas y continuas (RNF-3), un crecimiento acelerado del histórico (RNF-4) y respuestas rápidas en los tableros de control (RNF-5). En las siguientes secciones se presentan las colecciones definidas (3.4.1), las reglas de validación de esquema (3.4.2) y los patrones de modelo de datos aplicados (3.4.3).</w:t>
       </w:r>
     </w:p>
     <w:p>
@@ -68,6 +74,7 @@
       <w:r>
         <w:rPr>
           <w:b w:val="0"/>
+          <w:i w:val="0"/>
         </w:rPr>
         <w:t>Agregar debajo de las filas del TP1 de José Alonso Martínez Zeta, en cada criterio:</w:t>
       </w:r>
@@ -104,6 +111,7 @@
             <w:r>
               <w:rPr>
                 <w:b/>
+                <w:i w:val="0"/>
                 <w:sz w:val="20"/>
               </w:rPr>
               <w:t>Criterio</w:t>
@@ -129,6 +137,7 @@
             <w:r>
               <w:rPr>
                 <w:b/>
+                <w:i w:val="0"/>
                 <w:sz w:val="20"/>
               </w:rPr>
               <w:t>Acciones realizadas (agregar)</w:t>
@@ -150,6 +159,7 @@
             <w:r>
               <w:rPr>
                 <w:b w:val="0"/>
+                <w:i w:val="0"/>
                 <w:sz w:val="20"/>
               </w:rPr>
               <w:t>7.c1</w:t>
@@ -169,6 +179,7 @@
             <w:r>
               <w:rPr>
                 <w:b/>
+                <w:i w:val="0"/>
                 <w:sz w:val="20"/>
               </w:rPr>
               <w:t>TF:</w:t>
@@ -176,6 +187,7 @@
             <w:r>
               <w:rPr>
                 <w:b w:val="0"/>
+                <w:i w:val="0"/>
                 <w:sz w:val="20"/>
               </w:rPr>
               <w:t xml:space="preserve"> Desarrolló los patrones de modelo de datos del enfoque no relacional (embebido, referencia, Bucket, calculado, referencia extendida, subconjunto y polimórfico) y elaboró el diagrama de documentos de MongoDB, transformando las 25 tablas del modelo relacional normalizado en 14 colecciones alineadas con los requisitos no funcionales de SolarPulse IoT.</w:t>
@@ -196,6 +208,7 @@
             <w:r>
               <w:rPr>
                 <w:b w:val="0"/>
+                <w:i w:val="0"/>
                 <w:sz w:val="20"/>
               </w:rPr>
               <w:t>7.c2</w:t>
@@ -214,6 +227,7 @@
             <w:r>
               <w:rPr>
                 <w:b/>
+                <w:i w:val="0"/>
                 <w:sz w:val="20"/>
               </w:rPr>
               <w:t>TF:</w:t>
@@ -221,6 +235,7 @@
             <w:r>
               <w:rPr>
                 <w:b w:val="0"/>
+                <w:i w:val="0"/>
                 <w:sz w:val="20"/>
               </w:rPr>
               <w:t xml:space="preserve"> Reconocí la necesidad de aprender a modelar bases de datos documentales, investigando por cuenta propia los patrones de diseño de MongoDB para aplicarlos a la telemetría IoT y compararlos con el modelo relacional.</w:t>

</xml_diff>